<commit_message>
Apply final retention polish to The Tide Mother script
Co-Authored-By: Claude Opus 5.5 <noreply@anthropic.com>
Claude-Session: https://claude.ai/code/session_01YJE41d5btXjxgncsbRHMm3
</commit_message>
<xml_diff>
--- a/fableon/the-tide-mother/FABLEON-The-Tide-Mother-Production-Pack-v3.docx
+++ b/fableon/the-tide-mother/FABLEON-The-Tide-Mother-Production-Pack-v3.docx
@@ -2313,7 +2313,7 @@
         <w:t xml:space="preserve">Word count target:</w:t>
       </w:r>
       <w:r>
-        <w:t xml:space="preserve"> 700 spoken words of dialogue ±5% (665–735). The final script has 692 dialogue words, plus 266 words of narration (prologue, act bridges, lesson epilogue) added in v2, for a 30-minute film at about 0.53 words per second.</w:t>
+        <w:t xml:space="preserve"> 700 spoken words of dialogue ±5% (665–735). The final script has 692 dialogue words, plus 273 words of narration (prologue, act bridges, lesson epilogue) added in v2, for a 30-minute film at about 0.53 words per second.</w:t>
       </w:r>
     </w:p>
     <w:p>
@@ -2353,7 +2353,7 @@
         <w:t xml:space="preserve">Spoken words:</w:t>
       </w:r>
       <w:r>
-        <w:t xml:space="preserve"> 958 (692 dialogue + 266 narration) · about 0.53 words per second, between MYTHRA (0.41) and The Next Show (0.54).</w:t>
+        <w:t xml:space="preserve"> 965 (692 dialogue + 273 narration) · about 0.54 words per second, between MYTHRA (0.41) and The Next Show (0.54).</w:t>
       </w:r>
     </w:p>
     <w:p>
@@ -2411,7 +2411,7 @@
         <w:t xml:space="preserve">NARRATOR (V.O.):</w:t>
       </w:r>
       <w:r>
-        <w:t xml:space="preserve"> On the far edge of the northern sea, there is a village the maps forget. Its name is Kelvhaven.</w:t>
+        <w:t xml:space="preserve"> At the very edge of the northern sea sits a village most maps forget. Its name is Kelvhaven. And it lives by one strange rule.</w:t>
       </w:r>
     </w:p>
     <w:p>
@@ -2475,7 +2475,7 @@
         <w:t xml:space="preserve">NARRATOR (V.O.):</w:t>
       </w:r>
       <w:r>
-        <w:t xml:space="preserve"> For three hundred years, no one broke that law. Then came the winter of the great storm.</w:t>
+        <w:t xml:space="preserve"> For three hundred years, nobody broke that law. Not once. Then came the winter of the great storm.</w:t>
       </w:r>
     </w:p>
     <w:p>
@@ -2706,7 +2706,7 @@
         <w:spacing w:after="120"/>
       </w:pPr>
       <w:r>
-        <w:t xml:space="preserve">Dawn comes grey and quiet, as if the storm never happened. She hides the creature in a fish basket, deep in the cave where no one ever goes.</w:t>
+        <w:t xml:space="preserve">Dawn comes grey and quiet, as if the storm never happened. As if nothing happened at all. She hides the creature in a fish basket, deep in the cave where no one ever goes.</w:t>
       </w:r>
     </w:p>
     <w:p>
@@ -2882,7 +2882,7 @@
         <w:spacing w:after="120"/>
       </w:pPr>
       <w:r>
-        <w:t xml:space="preserve">That night, back in the cave, there is a new problem. Maren offers a cup of milk. The creature turns its head away.</w:t>
+        <w:t xml:space="preserve">That night, back in the cave, Maren runs into a problem no mother has ever had to solve. Maren offers a cup of milk. The creature turns its head away.</w:t>
       </w:r>
     </w:p>
     <w:p>
@@ -3193,7 +3193,7 @@
         <w:spacing w:after="120"/>
       </w:pPr>
       <w:r>
-        <w:t xml:space="preserve">Morning at the tidal pools. The happiest weeks of Maren's life begin. She lies flat on the rocks and puffs out her cheeks like a child.</w:t>
+        <w:t xml:space="preserve">And for a while, life is good. Mornings at the tidal pools become the happiest weeks of Maren's life. She lies flat on the rocks and puffs out her cheeks like a child.</w:t>
       </w:r>
     </w:p>
     <w:p>
@@ -3665,7 +3665,7 @@
         <w:spacing w:after="120"/>
       </w:pPr>
       <w:r>
-        <w:t xml:space="preserve">That same night, in the hidden cove, something new happens. Tal, big as a horse now, rises from the water and breathes out. And the sea catches fire. Blue flame, rolling across the waves.</w:t>
+        <w:t xml:space="preserve">That same night, in the hidden cove, Tal does something he has never done before. Tal, big as a horse now, rises from the water and breathes out. And the sea catches fire. Blue flame, rolling across the waves.</w:t>
       </w:r>
     </w:p>
     <w:p>
@@ -4599,7 +4599,7 @@
         <w:spacing w:after="120"/>
       </w:pPr>
       <w:r>
-        <w:t xml:space="preserve">A hidden beach, far from the village. Maren coughs up the sea. She is alive. Tal lays his giant head down beside her.</w:t>
+        <w:t xml:space="preserve">Later. A hidden beach, far from the village. Maren coughs up the sea. She is alive. Tal lays his giant head down beside her.</w:t>
       </w:r>
     </w:p>
     <w:p>
@@ -4799,7 +4799,7 @@
         <w:spacing w:after="120"/>
       </w:pPr>
       <w:r>
-        <w:t xml:space="preserve">Silence in the harbor. Slowly, the villagers come closer. Odile steps out first.</w:t>
+        <w:t xml:space="preserve">For a long moment, the harbor is completely silent. Slowly, the villagers come closer. Odile steps out first.</w:t>
       </w:r>
     </w:p>
     <w:p>
@@ -4971,7 +4971,7 @@
         <w:spacing w:after="120"/>
       </w:pPr>
       <w:r>
-        <w:t xml:space="preserve">Dawn over the open ocean. Tal flies low, his wings brushing the waves.</w:t>
+        <w:t xml:space="preserve">By dawn, Kelvhaven is far behind them. Tal flies low, his wings brushing the waves.</w:t>
       </w:r>
     </w:p>
     <w:p>
@@ -7174,7 +7174,7 @@
         <w:t xml:space="preserve">Script segment:</w:t>
       </w:r>
       <w:r>
-        <w:t xml:space="preserve"> "NARRATOR: On the far edge of the northern sea, there is a village the maps forget. Its name is Kelvhaven."</w:t>
+        <w:t xml:space="preserve"> "NARRATOR: At the very edge of the northern sea sits a village most maps forget. Its name is Kelvhaven. And it lives by one strange rule."</w:t>
       </w:r>
     </w:p>
     <w:p>
@@ -7702,7 +7702,7 @@
         <w:t xml:space="preserve">Script segment:</w:t>
       </w:r>
       <w:r>
-        <w:t xml:space="preserve"> "NARRATOR: For three hundred years, no one broke that law. Then came the winter of the great storm."</w:t>
+        <w:t xml:space="preserve"> "NARRATOR: For three hundred years, nobody broke that law. Not once. Then came the winter of the great storm."</w:t>
       </w:r>
     </w:p>
     <w:p>
@@ -9729,7 +9729,7 @@
         <w:t xml:space="preserve">Script segment:</w:t>
       </w:r>
       <w:r>
-        <w:t xml:space="preserve"> "Dawn comes grey and quiet, as if the storm never happened."</w:t>
+        <w:t xml:space="preserve"> "Dawn comes grey and quiet, as if the storm never happened. As if nothing happened at all."</w:t>
       </w:r>
     </w:p>
     <w:p>
@@ -10669,7 +10669,7 @@
         <w:t xml:space="preserve">Script segment:</w:t>
       </w:r>
       <w:r>
-        <w:t xml:space="preserve"> "That night, back in the cave, there is a new problem. Maren offers a cup of milk. The creature turns its head away. MAREN: Milk? No?"</w:t>
+        <w:t xml:space="preserve"> "That night, back in the cave, Maren runs into a problem no mother has ever had to solve. Maren offers a cup of milk. The creature turns its head away. MAREN: Milk? No?"</w:t>
       </w:r>
     </w:p>
     <w:p>
@@ -12284,7 +12284,7 @@
         <w:t xml:space="preserve">Script segment:</w:t>
       </w:r>
       <w:r>
-        <w:t xml:space="preserve"> "Morning at the tidal pools. The happiest weeks of Maren's life begin. She lies flat on the rocks and puffs out her cheeks like a child."</w:t>
+        <w:t xml:space="preserve"> "And for a while, life is good. Mornings at the tidal pools become the happiest weeks of Maren's life. She lies flat on the rocks and puffs out her cheeks like a child."</w:t>
       </w:r>
     </w:p>
     <w:p>
@@ -14824,7 +14824,7 @@
         <w:t xml:space="preserve">Script segment:</w:t>
       </w:r>
       <w:r>
-        <w:t xml:space="preserve"> "That same night, in the hidden cove, something new happens. Tal, big as a horse now, rises from the water and breathes out. And the sea catches fire. Blue flame, rolling across the waves."</w:t>
+        <w:t xml:space="preserve"> "That same night, in the hidden cove, Tal does something he has never done before. Tal, big as a horse now, rises from the water and breathes out. And the sea catches fire. Blue flame, rolling across the waves."</w:t>
       </w:r>
     </w:p>
     <w:p>
@@ -20330,7 +20330,7 @@
         <w:t xml:space="preserve">Script segment:</w:t>
       </w:r>
       <w:r>
-        <w:t xml:space="preserve"> "A hidden beach, far from the village. Maren coughs up the sea. She is alive."</w:t>
+        <w:t xml:space="preserve"> "Later. A hidden beach, far from the village. Maren coughs up the sea. She is alive."</w:t>
       </w:r>
     </w:p>
     <w:p>
@@ -21666,7 +21666,7 @@
         <w:t xml:space="preserve">Script segment:</w:t>
       </w:r>
       <w:r>
-        <w:t xml:space="preserve"> "Silence in the harbor. Slowly, the villagers come closer. Odile steps out first. ODILE: Maren. We were wrong."</w:t>
+        <w:t xml:space="preserve"> "For a long moment, the harbor is completely silent. Slowly, the villagers come closer. Odile steps out first. ODILE: Maren. We were wrong."</w:t>
       </w:r>
     </w:p>
     <w:p>
@@ -22466,7 +22466,7 @@
         <w:t xml:space="preserve">Script segment:</w:t>
       </w:r>
       <w:r>
-        <w:t xml:space="preserve"> "Dawn over the open ocean. Tal flies low, his wings brushing the waves. MAREN: Hold on, Tal."</w:t>
+        <w:t xml:space="preserve"> "By dawn, Kelvhaven is far behind them. Tal flies low, his wings brushing the waves. MAREN: Hold on, Tal."</w:t>
       </w:r>
     </w:p>
     <w:p>
@@ -23465,7 +23465,7 @@
         <w:t xml:space="preserve">Script segment:</w:t>
       </w:r>
       <w:r>
-        <w:t xml:space="preserve"> "NARRATOR: On the far edge of the northern sea, there is a village the maps forget. Its name is Kelvhaven."</w:t>
+        <w:t xml:space="preserve"> "NARRATOR: At the very edge of the northern sea sits a village most maps forget. Its name is Kelvhaven. And it lives by one strange rule."</w:t>
       </w:r>
     </w:p>
     <w:p>
@@ -23485,7 +23485,7 @@
         <w:t xml:space="preserve">Grok Imagine prompt:</w:t>
       </w:r>
       <w:r>
-        <w:t xml:space="preserve"> 15-second cinematic shot, 16:9, photorealistic dark fantasy, desaturated high-contrast grade, animate from the uploaded image. 0–5s: The drone skims low over the grey waves, gulls crossing the frame. 5–10s: It rises over the black sea cliffs; Narrator voice-over: "On the far edge of the northern sea, there is a village the maps forget. Its name is Kelvhaven." (a deep, resonant, unhurried older male storyteller with warm gravel and a faint Nordic lilt, like telling a legend by a fire). 10–15s: The village is revealed: turf roofs, chimney smoke, boats in the harbor. Camera: low aerial glide, then a rising crane reveal. Lighting stays the last cold light of dusk through heavy grey cloud, soft and diffused. Mood: mythic, mysterious, ominous. Sound: gentle waves, gulls, soft wind. Keep every face, costume and the dragon's design exactly as in the image; smooth, natural, physically real motion; no on-screen text.</w:t>
+        <w:t xml:space="preserve"> 15-second cinematic shot, 16:9, photorealistic dark fantasy, desaturated high-contrast grade, animate from the uploaded image. 0–5s: The drone skims low over the grey waves, gulls crossing the frame. 5–10s: It rises over the black sea cliffs; Narrator voice-over: "At the very edge of the northern sea sits a village most maps forget. Its name is Kelvhaven. And it lives by one strange rule." (a deep, resonant, unhurried older male storyteller with warm gravel and a faint Nordic lilt, like telling a legend by a fire). 10–15s: The village is revealed: turf roofs, chimney smoke, boats in the harbor. Camera: low aerial glide, then a rising crane reveal. Lighting stays the last cold light of dusk through heavy grey cloud, soft and diffused. Mood: mythic, mysterious, ominous. Sound: gentle waves, gulls, soft wind. Keep every face, costume and the dragon's design exactly as in the image; smooth, natural, physically real motion; no on-screen text.</w:t>
       </w:r>
     </w:p>
     <w:p>
@@ -23545,7 +23545,7 @@
         <w:t xml:space="preserve">Dialogue:</w:t>
       </w:r>
       <w:r>
-        <w:t xml:space="preserve"> Narrator: "On the far edge of the northern sea, there is a village the maps forget. Its name is Kelvhaven."</w:t>
+        <w:t xml:space="preserve"> Narrator: "At the very edge of the northern sea sits a village most maps forget. Its name is Kelvhaven. And it lives by one strange rule."</w:t>
       </w:r>
     </w:p>
     <w:p>
@@ -23925,7 +23925,7 @@
         <w:t xml:space="preserve">Script segment:</w:t>
       </w:r>
       <w:r>
-        <w:t xml:space="preserve"> "NARRATOR: For three hundred years, no one broke that law. Then came the winter of the great storm."</w:t>
+        <w:t xml:space="preserve"> "NARRATOR: For three hundred years, nobody broke that law. Not once. Then came the winter of the great storm."</w:t>
       </w:r>
     </w:p>
     <w:p>
@@ -23945,7 +23945,7 @@
         <w:t xml:space="preserve">Grok Imagine prompt:</w:t>
       </w:r>
       <w:r>
-        <w:t xml:space="preserve"> 15-second cinematic shot, 16:9, photorealistic dark fantasy, desaturated high-contrast grade, animate from the uploaded image. 0–5s: Moonlight lies over the sleeping village; Narrator voice-over: "For three hundred years, no one broke that law. Then came the winter of the great storm." (a deep, resonant, unhurried older male storyteller with warm gravel and a faint Nordic lilt, like telling a legend by a fire). 5–10s: Black storm clouds roll in from the sea. 10–15s: The clouds swallow the moon and the first rain hits. Camera: slow aerial drift as the sky darkens. Lighting stays cold moonlight through drifting cloud, deep shadows, one warm candle-lit window. Mood: foreboding. Sound: night wind, faint surf, a dog barking far away. Keep every face, costume and the dragon's design exactly as in the image; smooth, natural, physically real motion; no on-screen text.</w:t>
+        <w:t xml:space="preserve"> 15-second cinematic shot, 16:9, photorealistic dark fantasy, desaturated high-contrast grade, animate from the uploaded image. 0–5s: Moonlight lies over the sleeping village; Narrator voice-over: "For three hundred years, nobody broke that law. Not once. Then came the winter of the great storm." (a deep, resonant, unhurried older male storyteller with warm gravel and a faint Nordic lilt, like telling a legend by a fire). 5–10s: Black storm clouds roll in from the sea. 10–15s: The clouds swallow the moon and the first rain hits. Camera: slow aerial drift as the sky darkens. Lighting stays cold moonlight through drifting cloud, deep shadows, one warm candle-lit window. Mood: foreboding. Sound: night wind, faint surf, a dog barking far away. Keep every face, costume and the dragon's design exactly as in the image; smooth, natural, physically real motion; no on-screen text.</w:t>
       </w:r>
     </w:p>
     <w:p>
@@ -24005,7 +24005,7 @@
         <w:t xml:space="preserve">Dialogue:</w:t>
       </w:r>
       <w:r>
-        <w:t xml:space="preserve"> Narrator: "For three hundred years, no one broke that law. Then came the winter of the great storm."</w:t>
+        <w:t xml:space="preserve"> Narrator: "For three hundred years, nobody broke that law. Not once. Then came the winter of the great storm."</w:t>
       </w:r>
     </w:p>
     <w:p>
@@ -25697,7 +25697,7 @@
         <w:t xml:space="preserve">Script segment:</w:t>
       </w:r>
       <w:r>
-        <w:t xml:space="preserve"> "Dawn comes grey and quiet, as if the storm never happened."</w:t>
+        <w:t xml:space="preserve"> "Dawn comes grey and quiet, as if the storm never happened. As if nothing happened at all."</w:t>
       </w:r>
     </w:p>
     <w:p>
@@ -26518,7 +26518,7 @@
         <w:t xml:space="preserve">Script segment:</w:t>
       </w:r>
       <w:r>
-        <w:t xml:space="preserve"> "That night, back in the cave, there is a new problem. Maren offers a cup of milk. The creature turns its head away. MAREN: Milk? No?"</w:t>
+        <w:t xml:space="preserve"> "That night, back in the cave, Maren runs into a problem no mother has ever had to solve. Maren offers a cup of milk. The creature turns its head away. MAREN: Milk? No?"</w:t>
       </w:r>
     </w:p>
     <w:p>
@@ -27929,7 +27929,7 @@
         <w:t xml:space="preserve">Script segment:</w:t>
       </w:r>
       <w:r>
-        <w:t xml:space="preserve"> "Morning at the tidal pools. The happiest weeks of Maren's life begin. She lies flat on the rocks and puffs out her cheeks like a child."</w:t>
+        <w:t xml:space="preserve"> "And for a while, life is good. Mornings at the tidal pools become the happiest weeks of Maren's life. She lies flat on the rocks and puffs out her cheeks like a child."</w:t>
       </w:r>
     </w:p>
     <w:p>
@@ -30146,7 +30146,7 @@
         <w:t xml:space="preserve">Script segment:</w:t>
       </w:r>
       <w:r>
-        <w:t xml:space="preserve"> "That same night, in the hidden cove, something new happens. Tal, big as a horse now, rises from the water and breathes out. And the sea catches fire. Blue flame, rolling across the waves."</w:t>
+        <w:t xml:space="preserve"> "That same night, in the hidden cove, Tal does something he has never done before. Tal, big as a horse now, rises from the water and breathes out. And the sea catches fire. Blue flame, rolling across the waves."</w:t>
       </w:r>
     </w:p>
     <w:p>
@@ -34955,7 +34955,7 @@
         <w:t xml:space="preserve">Script segment:</w:t>
       </w:r>
       <w:r>
-        <w:t xml:space="preserve"> "A hidden beach, far from the village. Maren coughs up the sea. She is alive."</w:t>
+        <w:t xml:space="preserve"> "Later. A hidden beach, far from the village. Maren coughs up the sea. She is alive."</w:t>
       </w:r>
     </w:p>
     <w:p>
@@ -36121,7 +36121,7 @@
         <w:t xml:space="preserve">Script segment:</w:t>
       </w:r>
       <w:r>
-        <w:t xml:space="preserve"> "Silence in the harbor. Slowly, the villagers come closer. Odile steps out first. ODILE: Maren. We were wrong."</w:t>
+        <w:t xml:space="preserve"> "For a long moment, the harbor is completely silent. Slowly, the villagers come closer. Odile steps out first. ODILE: Maren. We were wrong."</w:t>
       </w:r>
     </w:p>
     <w:p>
@@ -36819,7 +36819,7 @@
         <w:t xml:space="preserve">Script segment:</w:t>
       </w:r>
       <w:r>
-        <w:t xml:space="preserve"> "Dawn over the open ocean. Tal flies low, his wings brushing the waves. MAREN: Hold on, Tal."</w:t>
+        <w:t xml:space="preserve"> "By dawn, Kelvhaven is far behind them. Tal flies low, his wings brushing the waves. MAREN: Hold on, Tal."</w:t>
       </w:r>
     </w:p>
     <w:p>

</xml_diff>

<commit_message>
Polish milk-scene transition in Tide Mother script
Co-Authored-By: Claude Opus 5.5 <noreply@anthropic.com>
Claude-Session: https://claude.ai/code/session_01YJE41d5btXjxgncsbRHMm3
</commit_message>
<xml_diff>
--- a/fableon/the-tide-mother/FABLEON-The-Tide-Mother-Production-Pack-v3.docx
+++ b/fableon/the-tide-mother/FABLEON-The-Tide-Mother-Production-Pack-v3.docx
@@ -2882,7 +2882,7 @@
         <w:spacing w:after="120"/>
       </w:pPr>
       <w:r>
-        <w:t xml:space="preserve">That night, back in the cave, Maren runs into a problem no mother has ever had to solve. Maren offers a cup of milk. The creature turns its head away.</w:t>
+        <w:t xml:space="preserve">That night, back in the cave, Maren runs into a problem no mother has ever had to solve. First she offers a cup of milk. The creature turns its head away.</w:t>
       </w:r>
     </w:p>
     <w:p>
@@ -10669,7 +10669,7 @@
         <w:t xml:space="preserve">Script segment:</w:t>
       </w:r>
       <w:r>
-        <w:t xml:space="preserve"> "That night, back in the cave, Maren runs into a problem no mother has ever had to solve. Maren offers a cup of milk. The creature turns its head away. MAREN: Milk? No?"</w:t>
+        <w:t xml:space="preserve"> "That night, back in the cave, Maren runs into a problem no mother has ever had to solve. First she offers a cup of milk. The creature turns its head away. MAREN: Milk? No?"</w:t>
       </w:r>
     </w:p>
     <w:p>
@@ -26518,7 +26518,7 @@
         <w:t xml:space="preserve">Script segment:</w:t>
       </w:r>
       <w:r>
-        <w:t xml:space="preserve"> "That night, back in the cave, Maren runs into a problem no mother has ever had to solve. Maren offers a cup of milk. The creature turns its head away. MAREN: Milk? No?"</w:t>
+        <w:t xml:space="preserve"> "That night, back in the cave, Maren runs into a problem no mother has ever had to solve. First she offers a cup of milk. The creature turns its head away. MAREN: Milk? No?"</w:t>
       </w:r>
     </w:p>
     <w:p>

</xml_diff>